<commit_message>
revert: restore clean italic subheadings in cvs deliverables
</commit_message>
<xml_diff>
--- a/cvs/Vinay_Kumar_CV.docx
+++ b/cvs/Vinay_Kumar_CV.docx
@@ -148,27 +148,17 @@
         <w:tabs>
           <w:tab w:val="right" w:pos="9026"/>
         </w:tabs>
-        <w:spacing w:after="15" w:before="50"/>
-      </w:pPr>
-      <w:r>
-        <w:rPr>
-          <w:rFonts w:ascii="Times New Roman" w:cs="Times New Roman" w:eastAsia="Times New Roman" w:hAnsi="Times New Roman"/>
-          <w:b/>
-          <w:bCs/>
-          <w:sz w:val="19"/>
-          <w:szCs w:val="19"/>
-        </w:rPr>
-        <w:t xml:space="preserve">Infosys</w:t>
-      </w:r>
-      <w:r>
-        <w:rPr>
-          <w:rFonts w:ascii="Times New Roman" w:cs="Times New Roman" w:eastAsia="Times New Roman" w:hAnsi="Times New Roman"/>
-          <w:b/>
-          <w:bCs/>
-          <w:sz w:val="18"/>
-          <w:szCs w:val="18"/>
-        </w:rPr>
-        <w:t xml:space="preserve"> — Senior AI Engineer</w:t>
+        <w:spacing w:after="15" w:before="45"/>
+      </w:pPr>
+      <w:r>
+        <w:rPr>
+          <w:rFonts w:ascii="Times New Roman" w:cs="Times New Roman" w:eastAsia="Times New Roman" w:hAnsi="Times New Roman"/>
+          <w:b/>
+          <w:bCs/>
+          <w:sz w:val="18"/>
+          <w:szCs w:val="18"/>
+        </w:rPr>
+        <w:t xml:space="preserve">Infosys — Senior AI Engineer</w:t>
       </w:r>
       <w:r>
         <w:rPr>
@@ -184,18 +174,20 @@
     </w:p>
     <w:p>
       <w:pPr>
-        <w:spacing w:after="10" w:before="40"/>
-      </w:pPr>
-      <w:r>
-        <w:rPr>
-          <w:rFonts w:ascii="Times New Roman" w:cs="Times New Roman" w:eastAsia="Times New Roman" w:hAnsi="Times New Roman"/>
-          <w:b/>
-          <w:bCs/>
-          <w:color w:val="4B5563"/>
-          <w:sz w:val="15"/>
-          <w:szCs w:val="15"/>
-        </w:rPr>
-        <w:t xml:space="preserve">FOUNDATIONAL COMPONENTS</w:t>
+        <w:spacing w:after="10" w:before="35"/>
+      </w:pPr>
+      <w:r>
+        <w:rPr>
+          <w:rFonts w:ascii="Times New Roman" w:cs="Times New Roman" w:eastAsia="Times New Roman" w:hAnsi="Times New Roman"/>
+          <w:b/>
+          <w:bCs/>
+          <w:i/>
+          <w:iCs/>
+          <w:color w:val="333333"/>
+          <w:sz w:val="17"/>
+          <w:szCs w:val="17"/>
+        </w:rPr>
+        <w:t xml:space="preserve">Foundational Components</w:t>
       </w:r>
     </w:p>
     <w:p>
@@ -284,18 +276,20 @@
     </w:p>
     <w:p>
       <w:pPr>
-        <w:spacing w:after="10" w:before="40"/>
-      </w:pPr>
-      <w:r>
-        <w:rPr>
-          <w:rFonts w:ascii="Times New Roman" w:cs="Times New Roman" w:eastAsia="Times New Roman" w:hAnsi="Times New Roman"/>
-          <w:b/>
-          <w:bCs/>
-          <w:color w:val="4B5563"/>
-          <w:sz w:val="15"/>
-          <w:szCs w:val="15"/>
-        </w:rPr>
-        <w:t xml:space="preserve">PRODUCTS</w:t>
+        <w:spacing w:after="10" w:before="35"/>
+      </w:pPr>
+      <w:r>
+        <w:rPr>
+          <w:rFonts w:ascii="Times New Roman" w:cs="Times New Roman" w:eastAsia="Times New Roman" w:hAnsi="Times New Roman"/>
+          <w:b/>
+          <w:bCs/>
+          <w:i/>
+          <w:iCs/>
+          <w:color w:val="333333"/>
+          <w:sz w:val="17"/>
+          <w:szCs w:val="17"/>
+        </w:rPr>
+        <w:t xml:space="preserve">Products</w:t>
       </w:r>
     </w:p>
     <w:p>
@@ -356,18 +350,20 @@
     </w:p>
     <w:p>
       <w:pPr>
-        <w:spacing w:after="10" w:before="40"/>
-      </w:pPr>
-      <w:r>
-        <w:rPr>
-          <w:rFonts w:ascii="Times New Roman" w:cs="Times New Roman" w:eastAsia="Times New Roman" w:hAnsi="Times New Roman"/>
-          <w:b/>
-          <w:bCs/>
-          <w:color w:val="4B5563"/>
-          <w:sz w:val="15"/>
-          <w:szCs w:val="15"/>
-        </w:rPr>
-        <w:t xml:space="preserve">SOLUTION ARCHITECTURE &amp; DEAL WINS</w:t>
+        <w:spacing w:after="10" w:before="35"/>
+      </w:pPr>
+      <w:r>
+        <w:rPr>
+          <w:rFonts w:ascii="Times New Roman" w:cs="Times New Roman" w:eastAsia="Times New Roman" w:hAnsi="Times New Roman"/>
+          <w:b/>
+          <w:bCs/>
+          <w:i/>
+          <w:iCs/>
+          <w:color w:val="333333"/>
+          <w:sz w:val="17"/>
+          <w:szCs w:val="17"/>
+        </w:rPr>
+        <w:t xml:space="preserve">Solution Architecture &amp; Deal Wins</w:t>
       </w:r>
     </w:p>
     <w:p>
@@ -390,18 +386,20 @@
     </w:p>
     <w:p>
       <w:pPr>
-        <w:spacing w:after="10" w:before="40"/>
-      </w:pPr>
-      <w:r>
-        <w:rPr>
-          <w:rFonts w:ascii="Times New Roman" w:cs="Times New Roman" w:eastAsia="Times New Roman" w:hAnsi="Times New Roman"/>
-          <w:b/>
-          <w:bCs/>
-          <w:color w:val="4B5563"/>
-          <w:sz w:val="15"/>
-          <w:szCs w:val="15"/>
-        </w:rPr>
-        <w:t xml:space="preserve">TECHNICAL</w:t>
+        <w:spacing w:after="10" w:before="35"/>
+      </w:pPr>
+      <w:r>
+        <w:rPr>
+          <w:rFonts w:ascii="Times New Roman" w:cs="Times New Roman" w:eastAsia="Times New Roman" w:hAnsi="Times New Roman"/>
+          <w:b/>
+          <w:bCs/>
+          <w:i/>
+          <w:iCs/>
+          <w:color w:val="333333"/>
+          <w:sz w:val="17"/>
+          <w:szCs w:val="17"/>
+        </w:rPr>
+        <w:t xml:space="preserve">Technical</w:t>
       </w:r>
     </w:p>
     <w:p>
@@ -437,27 +435,17 @@
         <w:tabs>
           <w:tab w:val="right" w:pos="9026"/>
         </w:tabs>
-        <w:spacing w:after="15" w:before="90"/>
-      </w:pPr>
-      <w:r>
-        <w:rPr>
-          <w:rFonts w:ascii="Times New Roman" w:cs="Times New Roman" w:eastAsia="Times New Roman" w:hAnsi="Times New Roman"/>
-          <w:b/>
-          <w:bCs/>
-          <w:sz w:val="19"/>
-          <w:szCs w:val="19"/>
-        </w:rPr>
-        <w:t xml:space="preserve">Xcaliber Infotech (A Phoenix Group Company)</w:t>
-      </w:r>
-      <w:r>
-        <w:rPr>
-          <w:rFonts w:ascii="Times New Roman" w:cs="Times New Roman" w:eastAsia="Times New Roman" w:hAnsi="Times New Roman"/>
-          <w:b/>
-          <w:bCs/>
-          <w:sz w:val="18"/>
-          <w:szCs w:val="18"/>
-        </w:rPr>
-        <w:t xml:space="preserve"> — Data Scientist / AI-ML Engineer</w:t>
+        <w:spacing w:after="15" w:before="80"/>
+      </w:pPr>
+      <w:r>
+        <w:rPr>
+          <w:rFonts w:ascii="Times New Roman" w:cs="Times New Roman" w:eastAsia="Times New Roman" w:hAnsi="Times New Roman"/>
+          <w:b/>
+          <w:bCs/>
+          <w:sz w:val="18"/>
+          <w:szCs w:val="18"/>
+        </w:rPr>
+        <w:t xml:space="preserve">Xcaliber Infotech (A Phoenix Group Company) — Data Scientist / AI-ML Engineer</w:t>
       </w:r>
       <w:r>
         <w:rPr>
@@ -468,7 +456,7 @@
           <w:sz w:val="17"/>
           <w:szCs w:val="17"/>
         </w:rPr>
-        <w:t xml:space="preserve">	Dec 2022 – Dec 2024 | Pune</w:t>
+        <w:t xml:space="preserve">	Dec 2022 – Dec 2024, Pune</w:t>
       </w:r>
     </w:p>
     <w:p>
@@ -588,27 +576,17 @@
         <w:tabs>
           <w:tab w:val="right" w:pos="9026"/>
         </w:tabs>
-        <w:spacing w:after="15" w:before="90"/>
-      </w:pPr>
-      <w:r>
-        <w:rPr>
-          <w:rFonts w:ascii="Times New Roman" w:cs="Times New Roman" w:eastAsia="Times New Roman" w:hAnsi="Times New Roman"/>
-          <w:b/>
-          <w:bCs/>
-          <w:sz w:val="19"/>
-          <w:szCs w:val="19"/>
-        </w:rPr>
-        <w:t xml:space="preserve">Concentrix India</w:t>
-      </w:r>
-      <w:r>
-        <w:rPr>
-          <w:rFonts w:ascii="Times New Roman" w:cs="Times New Roman" w:eastAsia="Times New Roman" w:hAnsi="Times New Roman"/>
-          <w:b/>
-          <w:bCs/>
-          <w:sz w:val="18"/>
-          <w:szCs w:val="18"/>
-        </w:rPr>
-        <w:t xml:space="preserve"> — Data Analyst</w:t>
+        <w:spacing w:after="15" w:before="80"/>
+      </w:pPr>
+      <w:r>
+        <w:rPr>
+          <w:rFonts w:ascii="Times New Roman" w:cs="Times New Roman" w:eastAsia="Times New Roman" w:hAnsi="Times New Roman"/>
+          <w:b/>
+          <w:bCs/>
+          <w:sz w:val="18"/>
+          <w:szCs w:val="18"/>
+        </w:rPr>
+        <w:t xml:space="preserve">Concentrix India — Data Analyst</w:t>
       </w:r>
       <w:r>
         <w:rPr>
@@ -619,7 +597,7 @@
           <w:sz w:val="17"/>
           <w:szCs w:val="17"/>
         </w:rPr>
-        <w:t xml:space="preserve">	Oct 2015 – Apr 2017 | Gurgaon</w:t>
+        <w:t xml:space="preserve">	Oct 2015 – Apr 2017, Gurgaon</w:t>
       </w:r>
     </w:p>
     <w:p>

</xml_diff>

<commit_message>
feat: use subtle hairline divider below each company header
</commit_message>
<xml_diff>
--- a/cvs/Vinay_Kumar_CV.docx
+++ b/cvs/Vinay_Kumar_CV.docx
@@ -145,6 +145,9 @@
     </w:p>
     <w:p>
       <w:pPr>
+        <w:pBdr>
+          <w:bottom w:val="single" w:color="9CA3AF" w:sz="4" w:space="1"/>
+        </w:pBdr>
         <w:tabs>
           <w:tab w:val="right" w:pos="9026"/>
         </w:tabs>
@@ -432,6 +435,9 @@
     </w:p>
     <w:p>
       <w:pPr>
+        <w:pBdr>
+          <w:bottom w:val="single" w:color="9CA3AF" w:sz="4" w:space="1"/>
+        </w:pBdr>
         <w:tabs>
           <w:tab w:val="right" w:pos="9026"/>
         </w:tabs>
@@ -573,6 +579,9 @@
     </w:p>
     <w:p>
       <w:pPr>
+        <w:pBdr>
+          <w:bottom w:val="single" w:color="9CA3AF" w:sz="4" w:space="1"/>
+        </w:pBdr>
         <w:tabs>
           <w:tab w:val="right" w:pos="9026"/>
         </w:tabs>

</xml_diff>

<commit_message>
feat: finalize and export approved deliverables to cvs/
</commit_message>
<xml_diff>
--- a/cvs/Vinay_Kumar_CV.docx
+++ b/cvs/Vinay_Kumar_CV.docx
@@ -4,123 +4,97 @@
   <w:body>
     <w:p>
       <w:pPr>
-        <w:spacing w:after="30"/>
+        <w:spacing w:after="20" w:before="0"/>
         <w:jc w:val="center"/>
       </w:pPr>
       <w:r>
         <w:rPr>
-          <w:rFonts w:ascii="Times New Roman" w:cs="Times New Roman" w:eastAsia="Times New Roman" w:hAnsi="Times New Roman"/>
-          <w:b/>
-          <w:bCs/>
-          <w:sz w:val="36"/>
-          <w:szCs w:val="36"/>
+          <w:rFonts w:ascii="EB Garamond" w:cs="EB Garamond" w:eastAsia="EB Garamond" w:hAnsi="EB Garamond"/>
+          <w:b/>
+          <w:bCs/>
+          <w:color w:val="111111"/>
+          <w:sz w:val="48"/>
+          <w:szCs w:val="48"/>
         </w:rPr>
         <w:t xml:space="preserve">Vinay Kumar</w:t>
       </w:r>
     </w:p>
     <w:p>
       <w:pPr>
-        <w:spacing w:after="30"/>
+        <w:spacing w:after="30" w:before="0"/>
         <w:jc w:val="center"/>
       </w:pPr>
       <w:r>
         <w:rPr>
-          <w:rFonts w:ascii="Times New Roman" w:cs="Times New Roman" w:eastAsia="Times New Roman" w:hAnsi="Times New Roman"/>
-          <w:b/>
-          <w:bCs/>
-          <w:sz w:val="22"/>
-          <w:szCs w:val="22"/>
+          <w:rFonts w:ascii="EB Garamond" w:cs="EB Garamond" w:eastAsia="EB Garamond" w:hAnsi="EB Garamond"/>
+          <w:b/>
+          <w:bCs/>
+          <w:color w:val="222222"/>
+          <w:sz w:val="24"/>
+          <w:szCs w:val="24"/>
         </w:rPr>
         <w:t xml:space="preserve">Senior AI Engineer</w:t>
       </w:r>
     </w:p>
     <w:p>
       <w:pPr>
-        <w:spacing w:after="100"/>
+        <w:spacing w:after="60" w:before="0"/>
         <w:jc w:val="center"/>
       </w:pPr>
       <w:r>
         <w:rPr>
-          <w:rFonts w:ascii="Times New Roman" w:cs="Times New Roman" w:eastAsia="Times New Roman" w:hAnsi="Times New Roman"/>
-          <w:sz w:val="18"/>
-          <w:szCs w:val="18"/>
-        </w:rPr>
-        <w:t xml:space="preserve">Pune, India  —  9992394789  —  </w:t>
-      </w:r>
-      <w:r>
-        <w:rPr>
-          <w:rFonts w:ascii="Times New Roman" w:cs="Times New Roman" w:eastAsia="Times New Roman" w:hAnsi="Times New Roman"/>
-          <w:color w:val="0000EE"/>
-          <w:sz w:val="18"/>
-          <w:szCs w:val="18"/>
-          <w:u w:val="single"/>
-        </w:rPr>
-        <w:t xml:space="preserve">viinaimadotra@gmail.com</w:t>
-      </w:r>
-      <w:r>
-        <w:rPr>
-          <w:rFonts w:ascii="Times New Roman" w:cs="Times New Roman" w:eastAsia="Times New Roman" w:hAnsi="Times New Roman"/>
-          <w:sz w:val="18"/>
-          <w:szCs w:val="18"/>
-        </w:rPr>
-        <w:t xml:space="preserve">  |  </w:t>
-      </w:r>
-      <w:r>
-        <w:rPr>
-          <w:rFonts w:ascii="Times New Roman" w:cs="Times New Roman" w:eastAsia="Times New Roman" w:hAnsi="Times New Roman"/>
-          <w:color w:val="0000EE"/>
-          <w:sz w:val="18"/>
-          <w:szCs w:val="18"/>
-          <w:u w:val="single"/>
-        </w:rPr>
-        <w:t xml:space="preserve">LinkedIn: in/viinai</w:t>
-      </w:r>
-      <w:r>
-        <w:rPr>
-          <w:rFonts w:ascii="Times New Roman" w:cs="Times New Roman" w:eastAsia="Times New Roman" w:hAnsi="Times New Roman"/>
-          <w:sz w:val="18"/>
-          <w:szCs w:val="18"/>
-        </w:rPr>
-        <w:t xml:space="preserve">  |  </w:t>
-      </w:r>
-      <w:r>
-        <w:rPr>
-          <w:rFonts w:ascii="Times New Roman" w:cs="Times New Roman" w:eastAsia="Times New Roman" w:hAnsi="Times New Roman"/>
-          <w:color w:val="0000EE"/>
-          <w:sz w:val="18"/>
-          <w:szCs w:val="18"/>
-          <w:u w:val="single"/>
-        </w:rPr>
-        <w:t xml:space="preserve">GitHub: github.com/ViinAI</w:t>
+          <w:rFonts w:ascii="EB Garamond" w:cs="EB Garamond" w:eastAsia="EB Garamond" w:hAnsi="EB Garamond"/>
+          <w:color w:val="333333"/>
+          <w:sz w:val="20"/>
+          <w:szCs w:val="20"/>
+        </w:rPr>
+        <w:t xml:space="preserve">Pune, India  —  9992394789  —  viinaimadotra@gmail.com</w:t>
+      </w:r>
+    </w:p>
+    <w:p>
+      <w:pPr>
+        <w:spacing w:after="100" w:before="0"/>
+        <w:jc w:val="center"/>
+      </w:pPr>
+      <w:r>
+        <w:rPr>
+          <w:rFonts w:ascii="EB Garamond" w:cs="EB Garamond" w:eastAsia="EB Garamond" w:hAnsi="EB Garamond"/>
+          <w:color w:val="0000ee"/>
+          <w:sz w:val="20"/>
+          <w:szCs w:val="20"/>
+        </w:rPr>
+        <w:t xml:space="preserve">LinkedIn: linkedin.com/in/viinai  |  GitHub: github.com/ViinAI</w:t>
       </w:r>
     </w:p>
     <w:p>
       <w:pPr>
         <w:pBdr>
-          <w:bottom w:val="single" w:color="000000" w:sz="6" w:space="1"/>
+          <w:bottom w:val="single" w:color="111111" w:sz="8" w:space="2"/>
         </w:pBdr>
-        <w:spacing w:after="25" w:before="70"/>
-      </w:pPr>
-      <w:r>
-        <w:rPr>
-          <w:rFonts w:ascii="Times New Roman" w:cs="Times New Roman" w:eastAsia="Times New Roman" w:hAnsi="Times New Roman"/>
-          <w:b/>
-          <w:bCs/>
-          <w:sz w:val="20"/>
-          <w:szCs w:val="20"/>
+        <w:spacing w:after="60" w:before="180"/>
+      </w:pPr>
+      <w:r>
+        <w:rPr>
+          <w:rFonts w:ascii="EB Garamond" w:cs="EB Garamond" w:eastAsia="EB Garamond" w:hAnsi="EB Garamond"/>
+          <w:b/>
+          <w:bCs/>
+          <w:color w:val="111111"/>
+          <w:sz w:val="28"/>
+          <w:szCs w:val="28"/>
         </w:rPr>
         <w:t xml:space="preserve">Professional Summary</w:t>
       </w:r>
     </w:p>
     <w:p>
       <w:pPr>
-        <w:spacing w:after="70"/>
-      </w:pPr>
-      <w:r>
-        <w:rPr>
-          <w:rFonts w:ascii="Times New Roman" w:cs="Times New Roman" w:eastAsia="Times New Roman" w:hAnsi="Times New Roman"/>
-          <w:sz w:val="18"/>
-          <w:szCs w:val="18"/>
+        <w:spacing w:after="60" w:before="40" w:line="250"/>
+        <w:jc w:val="both"/>
+      </w:pPr>
+      <w:r>
+        <w:rPr>
+          <w:rFonts w:ascii="EB Garamond" w:cs="EB Garamond" w:eastAsia="EB Garamond" w:hAnsi="EB Garamond"/>
+          <w:sz w:val="20"/>
+          <w:szCs w:val="20"/>
         </w:rPr>
         <w:t xml:space="preserve">Senior AI Engineer with 5.5+ years of experience in enterprise AI platform development, ML engineering, and Data Science. Designed and built foundational agent infrastructure, composed it into enterprise-grade products, and architected diverse AI solutions across multiple domains and clients at Infosys.</w:t>
       </w:r>
@@ -128,67 +102,66 @@
     <w:p>
       <w:pPr>
         <w:pBdr>
-          <w:bottom w:val="single" w:color="000000" w:sz="6" w:space="1"/>
+          <w:bottom w:val="single" w:color="111111" w:sz="8" w:space="2"/>
         </w:pBdr>
-        <w:spacing w:after="25" w:before="70"/>
-      </w:pPr>
-      <w:r>
-        <w:rPr>
-          <w:rFonts w:ascii="Times New Roman" w:cs="Times New Roman" w:eastAsia="Times New Roman" w:hAnsi="Times New Roman"/>
-          <w:b/>
-          <w:bCs/>
-          <w:sz w:val="20"/>
-          <w:szCs w:val="20"/>
+        <w:spacing w:after="60" w:before="180"/>
+      </w:pPr>
+      <w:r>
+        <w:rPr>
+          <w:rFonts w:ascii="EB Garamond" w:cs="EB Garamond" w:eastAsia="EB Garamond" w:hAnsi="EB Garamond"/>
+          <w:b/>
+          <w:bCs/>
+          <w:color w:val="111111"/>
+          <w:sz w:val="28"/>
+          <w:szCs w:val="28"/>
         </w:rPr>
         <w:t xml:space="preserve">Professional Experience</w:t>
       </w:r>
     </w:p>
     <w:p>
       <w:pPr>
-        <w:pBdr>
-          <w:bottom w:val="single" w:color="9CA3AF" w:sz="4" w:space="1"/>
-        </w:pBdr>
         <w:tabs>
           <w:tab w:val="right" w:pos="9026"/>
         </w:tabs>
-        <w:spacing w:after="15" w:before="45"/>
-      </w:pPr>
-      <w:r>
-        <w:rPr>
-          <w:rFonts w:ascii="Times New Roman" w:cs="Times New Roman" w:eastAsia="Times New Roman" w:hAnsi="Times New Roman"/>
-          <w:b/>
-          <w:bCs/>
-          <w:sz w:val="18"/>
-          <w:szCs w:val="18"/>
+        <w:spacing w:after="40" w:before="60"/>
+      </w:pPr>
+      <w:r>
+        <w:rPr>
+          <w:rFonts w:ascii="EB Garamond" w:cs="EB Garamond" w:eastAsia="EB Garamond" w:hAnsi="EB Garamond"/>
+          <w:b/>
+          <w:bCs/>
+          <w:color w:val="111111"/>
+          <w:sz w:val="24"/>
+          <w:szCs w:val="24"/>
         </w:rPr>
         <w:t xml:space="preserve">Infosys — Senior AI Engineer</w:t>
       </w:r>
       <w:r>
         <w:rPr>
-          <w:rFonts w:ascii="Times New Roman" w:cs="Times New Roman" w:eastAsia="Times New Roman" w:hAnsi="Times New Roman"/>
+          <w:rFonts w:ascii="EB Garamond" w:cs="EB Garamond" w:eastAsia="EB Garamond" w:hAnsi="EB Garamond"/>
           <w:b/>
           <w:bCs/>
           <w:color w:val="333333"/>
-          <w:sz w:val="17"/>
-          <w:szCs w:val="17"/>
+          <w:sz w:val="20"/>
+          <w:szCs w:val="20"/>
         </w:rPr>
         <w:t xml:space="preserve">	Dec 2024 – Present</w:t>
       </w:r>
     </w:p>
     <w:p>
       <w:pPr>
-        <w:spacing w:after="10" w:before="35"/>
-      </w:pPr>
-      <w:r>
-        <w:rPr>
-          <w:rFonts w:ascii="Times New Roman" w:cs="Times New Roman" w:eastAsia="Times New Roman" w:hAnsi="Times New Roman"/>
+        <w:spacing w:after="30" w:before="80"/>
+      </w:pPr>
+      <w:r>
+        <w:rPr>
+          <w:rFonts w:ascii="EB Garamond" w:cs="EB Garamond" w:eastAsia="EB Garamond" w:hAnsi="EB Garamond"/>
           <w:b/>
           <w:bCs/>
           <w:i/>
           <w:iCs/>
-          <w:color w:val="333333"/>
-          <w:sz w:val="17"/>
-          <w:szCs w:val="17"/>
+          <w:color w:val="222222"/>
+          <w:sz w:val="20"/>
+          <w:szCs w:val="20"/>
         </w:rPr>
         <w:t xml:space="preserve">Foundational Components</w:t>
       </w:r>
@@ -200,23 +173,26 @@
           <w:ilvl w:val="0"/>
           <w:numId w:val="1"/>
         </w:numPr>
-        <w:spacing w:after="15"/>
-      </w:pPr>
-      <w:r>
-        <w:rPr>
-          <w:rFonts w:ascii="Times New Roman" w:cs="Times New Roman" w:eastAsia="Times New Roman" w:hAnsi="Times New Roman"/>
-          <w:b/>
-          <w:bCs/>
-          <w:sz w:val="17"/>
-          <w:szCs w:val="17"/>
+        <w:spacing w:after="25" w:before="25" w:line="250"/>
+        <w:jc w:val="both"/>
+      </w:pPr>
+      <w:r>
+        <w:rPr>
+          <w:rFonts w:ascii="EB Garamond" w:cs="EB Garamond" w:eastAsia="EB Garamond" w:hAnsi="EB Garamond"/>
+          <w:b/>
+          <w:bCs/>
+          <w:color w:val="111111"/>
+          <w:sz w:val="20"/>
+          <w:szCs w:val="20"/>
         </w:rPr>
         <w:t xml:space="preserve">Execution Harness: </w:t>
       </w:r>
       <w:r>
         <w:rPr>
-          <w:rFonts w:ascii="Times New Roman" w:cs="Times New Roman" w:eastAsia="Times New Roman" w:hAnsi="Times New Roman"/>
-          <w:sz w:val="17"/>
-          <w:szCs w:val="17"/>
+          <w:rFonts w:ascii="EB Garamond" w:cs="EB Garamond" w:eastAsia="EB Garamond" w:hAnsi="EB Garamond"/>
+          <w:color w:val="111111"/>
+          <w:sz w:val="20"/>
+          <w:szCs w:val="20"/>
         </w:rPr>
         <w:t xml:space="preserve">Designed and built a bespoke event-driven agent execution engine supporting deterministic state reconstruction, checkpointing, and long-running workflow continuity across distributed agent instances.</w:t>
       </w:r>
@@ -228,23 +204,26 @@
           <w:ilvl w:val="0"/>
           <w:numId w:val="1"/>
         </w:numPr>
-        <w:spacing w:after="15"/>
-      </w:pPr>
-      <w:r>
-        <w:rPr>
-          <w:rFonts w:ascii="Times New Roman" w:cs="Times New Roman" w:eastAsia="Times New Roman" w:hAnsi="Times New Roman"/>
-          <w:b/>
-          <w:bCs/>
-          <w:sz w:val="17"/>
-          <w:szCs w:val="17"/>
+        <w:spacing w:after="25" w:before="25" w:line="250"/>
+        <w:jc w:val="both"/>
+      </w:pPr>
+      <w:r>
+        <w:rPr>
+          <w:rFonts w:ascii="EB Garamond" w:cs="EB Garamond" w:eastAsia="EB Garamond" w:hAnsi="EB Garamond"/>
+          <w:b/>
+          <w:bCs/>
+          <w:color w:val="111111"/>
+          <w:sz w:val="20"/>
+          <w:szCs w:val="20"/>
         </w:rPr>
         <w:t xml:space="preserve">Sandbox: </w:t>
       </w:r>
       <w:r>
         <w:rPr>
-          <w:rFonts w:ascii="Times New Roman" w:cs="Times New Roman" w:eastAsia="Times New Roman" w:hAnsi="Times New Roman"/>
-          <w:sz w:val="17"/>
-          <w:szCs w:val="17"/>
+          <w:rFonts w:ascii="EB Garamond" w:cs="EB Garamond" w:eastAsia="EB Garamond" w:hAnsi="EB Garamond"/>
+          <w:color w:val="111111"/>
+          <w:sz w:val="20"/>
+          <w:szCs w:val="20"/>
         </w:rPr>
         <w:t xml:space="preserve">Built an isolated execution sandbox leveraging gVisor for secure, reproducible execution of untrusted agent code, MCP servers, and dynamically loaded skills.</w:t>
       </w:r>
@@ -256,41 +235,44 @@
           <w:ilvl w:val="0"/>
           <w:numId w:val="1"/>
         </w:numPr>
-        <w:spacing w:after="15"/>
-      </w:pPr>
-      <w:r>
-        <w:rPr>
-          <w:rFonts w:ascii="Times New Roman" w:cs="Times New Roman" w:eastAsia="Times New Roman" w:hAnsi="Times New Roman"/>
-          <w:b/>
-          <w:bCs/>
-          <w:sz w:val="17"/>
-          <w:szCs w:val="17"/>
+        <w:spacing w:after="25" w:before="25" w:line="250"/>
+        <w:jc w:val="both"/>
+      </w:pPr>
+      <w:r>
+        <w:rPr>
+          <w:rFonts w:ascii="EB Garamond" w:cs="EB Garamond" w:eastAsia="EB Garamond" w:hAnsi="EB Garamond"/>
+          <w:b/>
+          <w:bCs/>
+          <w:color w:val="111111"/>
+          <w:sz w:val="20"/>
+          <w:szCs w:val="20"/>
         </w:rPr>
         <w:t xml:space="preserve">MCP Platform: </w:t>
       </w:r>
       <w:r>
         <w:rPr>
-          <w:rFonts w:ascii="Times New Roman" w:cs="Times New Roman" w:eastAsia="Times New Roman" w:hAnsi="Times New Roman"/>
-          <w:sz w:val="17"/>
-          <w:szCs w:val="17"/>
+          <w:rFonts w:ascii="EB Garamond" w:cs="EB Garamond" w:eastAsia="EB Garamond" w:hAnsi="EB Garamond"/>
+          <w:color w:val="111111"/>
+          <w:sz w:val="20"/>
+          <w:szCs w:val="20"/>
         </w:rPr>
         <w:t xml:space="preserve">Created a platform for importing, building, and hosting Model Context Protocol (MCP) servers with AI-assisted authoring, validation, and lifecycle management.</w:t>
       </w:r>
     </w:p>
     <w:p>
       <w:pPr>
-        <w:spacing w:after="10" w:before="35"/>
-      </w:pPr>
-      <w:r>
-        <w:rPr>
-          <w:rFonts w:ascii="Times New Roman" w:cs="Times New Roman" w:eastAsia="Times New Roman" w:hAnsi="Times New Roman"/>
+        <w:spacing w:after="30" w:before="80"/>
+      </w:pPr>
+      <w:r>
+        <w:rPr>
+          <w:rFonts w:ascii="EB Garamond" w:cs="EB Garamond" w:eastAsia="EB Garamond" w:hAnsi="EB Garamond"/>
           <w:b/>
           <w:bCs/>
           <w:i/>
           <w:iCs/>
-          <w:color w:val="333333"/>
-          <w:sz w:val="17"/>
-          <w:szCs w:val="17"/>
+          <w:color w:val="222222"/>
+          <w:sz w:val="20"/>
+          <w:szCs w:val="20"/>
         </w:rPr>
         <w:t xml:space="preserve">Products</w:t>
       </w:r>
@@ -302,23 +284,26 @@
           <w:ilvl w:val="0"/>
           <w:numId w:val="1"/>
         </w:numPr>
-        <w:spacing w:after="15"/>
-      </w:pPr>
-      <w:r>
-        <w:rPr>
-          <w:rFonts w:ascii="Times New Roman" w:cs="Times New Roman" w:eastAsia="Times New Roman" w:hAnsi="Times New Roman"/>
-          <w:b/>
-          <w:bCs/>
-          <w:sz w:val="17"/>
-          <w:szCs w:val="17"/>
+        <w:spacing w:after="25" w:before="25" w:line="250"/>
+        <w:jc w:val="both"/>
+      </w:pPr>
+      <w:r>
+        <w:rPr>
+          <w:rFonts w:ascii="EB Garamond" w:cs="EB Garamond" w:eastAsia="EB Garamond" w:hAnsi="EB Garamond"/>
+          <w:b/>
+          <w:bCs/>
+          <w:color w:val="111111"/>
+          <w:sz w:val="20"/>
+          <w:szCs w:val="20"/>
         </w:rPr>
         <w:t xml:space="preserve">Process-Centric Harness: </w:t>
       </w:r>
       <w:r>
         <w:rPr>
-          <w:rFonts w:ascii="Times New Roman" w:cs="Times New Roman" w:eastAsia="Times New Roman" w:hAnsi="Times New Roman"/>
-          <w:sz w:val="17"/>
-          <w:szCs w:val="17"/>
+          <w:rFonts w:ascii="EB Garamond" w:cs="EB Garamond" w:eastAsia="EB Garamond" w:hAnsi="EB Garamond"/>
+          <w:color w:val="111111"/>
+          <w:sz w:val="20"/>
+          <w:szCs w:val="20"/>
         </w:rPr>
         <w:t xml:space="preserve">Composed foundational components into a full product enabling end-to-end process authoring, skill linking, OpenAPI spec onboarding, and autonomous execution. Deployed across multiple enterprise clients and under active go-to-market.</w:t>
       </w:r>
@@ -330,41 +315,44 @@
           <w:ilvl w:val="0"/>
           <w:numId w:val="1"/>
         </w:numPr>
-        <w:spacing w:after="15"/>
-      </w:pPr>
-      <w:r>
-        <w:rPr>
-          <w:rFonts w:ascii="Times New Roman" w:cs="Times New Roman" w:eastAsia="Times New Roman" w:hAnsi="Times New Roman"/>
-          <w:b/>
-          <w:bCs/>
-          <w:sz w:val="17"/>
-          <w:szCs w:val="17"/>
+        <w:spacing w:after="25" w:before="25" w:line="250"/>
+        <w:jc w:val="both"/>
+      </w:pPr>
+      <w:r>
+        <w:rPr>
+          <w:rFonts w:ascii="EB Garamond" w:cs="EB Garamond" w:eastAsia="EB Garamond" w:hAnsi="EB Garamond"/>
+          <w:b/>
+          <w:bCs/>
+          <w:color w:val="111111"/>
+          <w:sz w:val="20"/>
+          <w:szCs w:val="20"/>
         </w:rPr>
         <w:t xml:space="preserve">User-Centric Harness: </w:t>
       </w:r>
       <w:r>
         <w:rPr>
-          <w:rFonts w:ascii="Times New Roman" w:cs="Times New Roman" w:eastAsia="Times New Roman" w:hAnsi="Times New Roman"/>
-          <w:sz w:val="17"/>
-          <w:szCs w:val="17"/>
+          <w:rFonts w:ascii="EB Garamond" w:cs="EB Garamond" w:eastAsia="EB Garamond" w:hAnsi="EB Garamond"/>
+          <w:color w:val="111111"/>
+          <w:sz w:val="20"/>
+          <w:szCs w:val="20"/>
         </w:rPr>
         <w:t xml:space="preserve">Built a multi-surface developer platform — including Web Portal (AGUI/A2UI), CLI, and VS Code Extension — exposing agent capabilities for developer and operational workflows.</w:t>
       </w:r>
     </w:p>
     <w:p>
       <w:pPr>
-        <w:spacing w:after="10" w:before="35"/>
-      </w:pPr>
-      <w:r>
-        <w:rPr>
-          <w:rFonts w:ascii="Times New Roman" w:cs="Times New Roman" w:eastAsia="Times New Roman" w:hAnsi="Times New Roman"/>
+        <w:spacing w:after="30" w:before="80"/>
+      </w:pPr>
+      <w:r>
+        <w:rPr>
+          <w:rFonts w:ascii="EB Garamond" w:cs="EB Garamond" w:eastAsia="EB Garamond" w:hAnsi="EB Garamond"/>
           <w:b/>
           <w:bCs/>
           <w:i/>
           <w:iCs/>
-          <w:color w:val="333333"/>
-          <w:sz w:val="17"/>
-          <w:szCs w:val="17"/>
+          <w:color w:val="222222"/>
+          <w:sz w:val="20"/>
+          <w:szCs w:val="20"/>
         </w:rPr>
         <w:t xml:space="preserve">Solution Architecture &amp; Deal Wins</w:t>
       </w:r>
@@ -376,91 +364,45 @@
           <w:ilvl w:val="0"/>
           <w:numId w:val="1"/>
         </w:numPr>
-        <w:spacing w:after="15"/>
-      </w:pPr>
-      <w:r>
-        <w:rPr>
-          <w:rFonts w:ascii="Times New Roman" w:cs="Times New Roman" w:eastAsia="Times New Roman" w:hAnsi="Times New Roman"/>
-          <w:sz w:val="17"/>
-          <w:szCs w:val="17"/>
+        <w:spacing w:after="25" w:before="25" w:line="250"/>
+        <w:jc w:val="both"/>
+      </w:pPr>
+      <w:r>
+        <w:rPr>
+          <w:rFonts w:ascii="EB Garamond" w:cs="EB Garamond" w:eastAsia="EB Garamond" w:hAnsi="EB Garamond"/>
+          <w:color w:val="111111"/>
+          <w:sz w:val="20"/>
+          <w:szCs w:val="20"/>
         </w:rPr>
         <w:t xml:space="preserve">Independently architected diverse AI solutions — including a $300M Telecom transformation, Digital Tutor platform, and CMDB platform — driving multiple deal wins for Infosys.</w:t>
       </w:r>
     </w:p>
     <w:p>
       <w:pPr>
-        <w:spacing w:after="10" w:before="35"/>
-      </w:pPr>
-      <w:r>
-        <w:rPr>
-          <w:rFonts w:ascii="Times New Roman" w:cs="Times New Roman" w:eastAsia="Times New Roman" w:hAnsi="Times New Roman"/>
-          <w:b/>
-          <w:bCs/>
-          <w:i/>
-          <w:iCs/>
-          <w:color w:val="333333"/>
-          <w:sz w:val="17"/>
-          <w:szCs w:val="17"/>
-        </w:rPr>
-        <w:t xml:space="preserve">Technical</w:t>
-      </w:r>
-    </w:p>
-    <w:p>
-      <w:pPr>
-        <w:pStyle w:val="ListParagraph"/>
-        <w:numPr>
-          <w:ilvl w:val="0"/>
-          <w:numId w:val="1"/>
-        </w:numPr>
-        <w:spacing w:after="15"/>
-      </w:pPr>
-      <w:r>
-        <w:rPr>
-          <w:rFonts w:ascii="Times New Roman" w:cs="Times New Roman" w:eastAsia="Times New Roman" w:hAnsi="Times New Roman"/>
-          <w:b/>
-          <w:bCs/>
-          <w:sz w:val="17"/>
-          <w:szCs w:val="17"/>
-        </w:rPr>
-        <w:t xml:space="preserve">LLM Compiler: </w:t>
-      </w:r>
-      <w:r>
-        <w:rPr>
-          <w:rFonts w:ascii="Times New Roman" w:cs="Times New Roman" w:eastAsia="Times New Roman" w:hAnsi="Times New Roman"/>
-          <w:sz w:val="17"/>
-          <w:szCs w:val="17"/>
-        </w:rPr>
-        <w:t xml:space="preserve">Built a proprietary LLM execution optimizer with dynamic prompt planning and semantic caching, reducing median query latency by 35%.</w:t>
-      </w:r>
-    </w:p>
-    <w:p>
-      <w:pPr>
-        <w:pBdr>
-          <w:bottom w:val="single" w:color="9CA3AF" w:sz="4" w:space="1"/>
-        </w:pBdr>
         <w:tabs>
           <w:tab w:val="right" w:pos="9026"/>
         </w:tabs>
-        <w:spacing w:after="15" w:before="80"/>
-      </w:pPr>
-      <w:r>
-        <w:rPr>
-          <w:rFonts w:ascii="Times New Roman" w:cs="Times New Roman" w:eastAsia="Times New Roman" w:hAnsi="Times New Roman"/>
-          <w:b/>
-          <w:bCs/>
-          <w:sz w:val="18"/>
-          <w:szCs w:val="18"/>
-        </w:rPr>
-        <w:t xml:space="preserve">Xcaliber Infotech (A Phoenix Group Company) — Data Scientist / AI-ML Engineer</w:t>
-      </w:r>
-      <w:r>
-        <w:rPr>
-          <w:rFonts w:ascii="Times New Roman" w:cs="Times New Roman" w:eastAsia="Times New Roman" w:hAnsi="Times New Roman"/>
+        <w:spacing w:after="40" w:before="200"/>
+      </w:pPr>
+      <w:r>
+        <w:rPr>
+          <w:rFonts w:ascii="EB Garamond" w:cs="EB Garamond" w:eastAsia="EB Garamond" w:hAnsi="EB Garamond"/>
+          <w:b/>
+          <w:bCs/>
+          <w:color w:val="111111"/>
+          <w:sz w:val="24"/>
+          <w:szCs w:val="24"/>
+        </w:rPr>
+        <w:t xml:space="preserve">Xcaliber Infotech — AI Engineer</w:t>
+      </w:r>
+      <w:r>
+        <w:rPr>
+          <w:rFonts w:ascii="EB Garamond" w:cs="EB Garamond" w:eastAsia="EB Garamond" w:hAnsi="EB Garamond"/>
           <w:b/>
           <w:bCs/>
           <w:color w:val="333333"/>
-          <w:sz w:val="17"/>
-          <w:szCs w:val="17"/>
+          <w:sz w:val="20"/>
+          <w:szCs w:val="20"/>
         </w:rPr>
         <w:t xml:space="preserve">	Dec 2022 – Dec 2024, Pune</w:t>
       </w:r>
@@ -472,23 +414,26 @@
           <w:ilvl w:val="0"/>
           <w:numId w:val="1"/>
         </w:numPr>
-        <w:spacing w:after="15"/>
-      </w:pPr>
-      <w:r>
-        <w:rPr>
-          <w:rFonts w:ascii="Times New Roman" w:cs="Times New Roman" w:eastAsia="Times New Roman" w:hAnsi="Times New Roman"/>
-          <w:b/>
-          <w:bCs/>
-          <w:sz w:val="17"/>
-          <w:szCs w:val="17"/>
+        <w:spacing w:after="25" w:before="25" w:line="250"/>
+        <w:jc w:val="both"/>
+      </w:pPr>
+      <w:r>
+        <w:rPr>
+          <w:rFonts w:ascii="EB Garamond" w:cs="EB Garamond" w:eastAsia="EB Garamond" w:hAnsi="EB Garamond"/>
+          <w:b/>
+          <w:bCs/>
+          <w:color w:val="111111"/>
+          <w:sz w:val="20"/>
+          <w:szCs w:val="20"/>
         </w:rPr>
         <w:t xml:space="preserve">Summarization Microservice: </w:t>
       </w:r>
       <w:r>
         <w:rPr>
-          <w:rFonts w:ascii="Times New Roman" w:cs="Times New Roman" w:eastAsia="Times New Roman" w:hAnsi="Times New Roman"/>
-          <w:sz w:val="17"/>
-          <w:szCs w:val="17"/>
+          <w:rFonts w:ascii="EB Garamond" w:cs="EB Garamond" w:eastAsia="EB Garamond" w:hAnsi="EB Garamond"/>
+          <w:color w:val="111111"/>
+          <w:sz w:val="20"/>
+          <w:szCs w:val="20"/>
         </w:rPr>
         <w:t xml:space="preserve">Built a high-throughput text summarization service using LLaMA, BART, spaCy, and PyTorch to process OEM delivery waiver comments, integrating with warehouse ERP systems.</w:t>
       </w:r>
@@ -500,23 +445,26 @@
           <w:ilvl w:val="0"/>
           <w:numId w:val="1"/>
         </w:numPr>
-        <w:spacing w:after="15"/>
-      </w:pPr>
-      <w:r>
-        <w:rPr>
-          <w:rFonts w:ascii="Times New Roman" w:cs="Times New Roman" w:eastAsia="Times New Roman" w:hAnsi="Times New Roman"/>
-          <w:b/>
-          <w:bCs/>
-          <w:sz w:val="17"/>
-          <w:szCs w:val="17"/>
+        <w:spacing w:after="25" w:before="25" w:line="250"/>
+        <w:jc w:val="both"/>
+      </w:pPr>
+      <w:r>
+        <w:rPr>
+          <w:rFonts w:ascii="EB Garamond" w:cs="EB Garamond" w:eastAsia="EB Garamond" w:hAnsi="EB Garamond"/>
+          <w:b/>
+          <w:bCs/>
+          <w:color w:val="111111"/>
+          <w:sz w:val="20"/>
+          <w:szCs w:val="20"/>
         </w:rPr>
         <w:t xml:space="preserve">Enterprise RAG Assistant: </w:t>
       </w:r>
       <w:r>
         <w:rPr>
-          <w:rFonts w:ascii="Times New Roman" w:cs="Times New Roman" w:eastAsia="Times New Roman" w:hAnsi="Times New Roman"/>
-          <w:sz w:val="17"/>
-          <w:szCs w:val="17"/>
+          <w:rFonts w:ascii="EB Garamond" w:cs="EB Garamond" w:eastAsia="EB Garamond" w:hAnsi="EB Garamond"/>
+          <w:color w:val="111111"/>
+          <w:sz w:val="20"/>
+          <w:szCs w:val="20"/>
         </w:rPr>
         <w:t xml:space="preserve">Developed a conversational assistant using LangChain, ChromaDB, and Hugging Face Transformers, reducing internal document lookup time by 40%.</w:t>
       </w:r>
@@ -528,23 +476,26 @@
           <w:ilvl w:val="0"/>
           <w:numId w:val="1"/>
         </w:numPr>
-        <w:spacing w:after="15"/>
-      </w:pPr>
-      <w:r>
-        <w:rPr>
-          <w:rFonts w:ascii="Times New Roman" w:cs="Times New Roman" w:eastAsia="Times New Roman" w:hAnsi="Times New Roman"/>
-          <w:b/>
-          <w:bCs/>
-          <w:sz w:val="17"/>
-          <w:szCs w:val="17"/>
+        <w:spacing w:after="25" w:before="25" w:line="250"/>
+        <w:jc w:val="both"/>
+      </w:pPr>
+      <w:r>
+        <w:rPr>
+          <w:rFonts w:ascii="EB Garamond" w:cs="EB Garamond" w:eastAsia="EB Garamond" w:hAnsi="EB Garamond"/>
+          <w:b/>
+          <w:bCs/>
+          <w:color w:val="111111"/>
+          <w:sz w:val="20"/>
+          <w:szCs w:val="20"/>
         </w:rPr>
         <w:t xml:space="preserve">Accessory Recommender: </w:t>
       </w:r>
       <w:r>
         <w:rPr>
-          <w:rFonts w:ascii="Times New Roman" w:cs="Times New Roman" w:eastAsia="Times New Roman" w:hAnsi="Times New Roman"/>
-          <w:sz w:val="17"/>
-          <w:szCs w:val="17"/>
+          <w:rFonts w:ascii="EB Garamond" w:cs="EB Garamond" w:eastAsia="EB Garamond" w:hAnsi="EB Garamond"/>
+          <w:color w:val="111111"/>
+          <w:sz w:val="20"/>
+          <w:szCs w:val="20"/>
         </w:rPr>
         <w:t xml:space="preserve">Designed a location-aware affinity recommendation engine matching regional inventory with purchase patterns, boosting weekly accessory bundle sales by 25%.</w:t>
       </w:r>
@@ -556,55 +507,56 @@
           <w:ilvl w:val="0"/>
           <w:numId w:val="1"/>
         </w:numPr>
-        <w:spacing w:after="15"/>
-      </w:pPr>
-      <w:r>
-        <w:rPr>
-          <w:rFonts w:ascii="Times New Roman" w:cs="Times New Roman" w:eastAsia="Times New Roman" w:hAnsi="Times New Roman"/>
-          <w:b/>
-          <w:bCs/>
-          <w:sz w:val="17"/>
-          <w:szCs w:val="17"/>
+        <w:spacing w:after="25" w:before="25" w:line="250"/>
+        <w:jc w:val="both"/>
+      </w:pPr>
+      <w:r>
+        <w:rPr>
+          <w:rFonts w:ascii="EB Garamond" w:cs="EB Garamond" w:eastAsia="EB Garamond" w:hAnsi="EB Garamond"/>
+          <w:b/>
+          <w:bCs/>
+          <w:color w:val="111111"/>
+          <w:sz w:val="20"/>
+          <w:szCs w:val="20"/>
         </w:rPr>
         <w:t xml:space="preserve">API &amp; Telemetry Layer: </w:t>
       </w:r>
       <w:r>
         <w:rPr>
-          <w:rFonts w:ascii="Times New Roman" w:cs="Times New Roman" w:eastAsia="Times New Roman" w:hAnsi="Times New Roman"/>
-          <w:sz w:val="17"/>
-          <w:szCs w:val="17"/>
+          <w:rFonts w:ascii="EB Garamond" w:cs="EB Garamond" w:eastAsia="EB Garamond" w:hAnsi="EB Garamond"/>
+          <w:color w:val="111111"/>
+          <w:sz w:val="20"/>
+          <w:szCs w:val="20"/>
         </w:rPr>
         <w:t xml:space="preserve">Developed REST APIs and real-time operations dashboards for role-based analytics and audit tracking.</w:t>
       </w:r>
     </w:p>
     <w:p>
       <w:pPr>
-        <w:pBdr>
-          <w:bottom w:val="single" w:color="9CA3AF" w:sz="4" w:space="1"/>
-        </w:pBdr>
         <w:tabs>
           <w:tab w:val="right" w:pos="9026"/>
         </w:tabs>
-        <w:spacing w:after="15" w:before="80"/>
-      </w:pPr>
-      <w:r>
-        <w:rPr>
-          <w:rFonts w:ascii="Times New Roman" w:cs="Times New Roman" w:eastAsia="Times New Roman" w:hAnsi="Times New Roman"/>
-          <w:b/>
-          <w:bCs/>
-          <w:sz w:val="18"/>
-          <w:szCs w:val="18"/>
+        <w:spacing w:after="40" w:before="200"/>
+      </w:pPr>
+      <w:r>
+        <w:rPr>
+          <w:rFonts w:ascii="EB Garamond" w:cs="EB Garamond" w:eastAsia="EB Garamond" w:hAnsi="EB Garamond"/>
+          <w:b/>
+          <w:bCs/>
+          <w:color w:val="111111"/>
+          <w:sz w:val="24"/>
+          <w:szCs w:val="24"/>
         </w:rPr>
         <w:t xml:space="preserve">Concentrix India — Data Analyst</w:t>
       </w:r>
       <w:r>
         <w:rPr>
-          <w:rFonts w:ascii="Times New Roman" w:cs="Times New Roman" w:eastAsia="Times New Roman" w:hAnsi="Times New Roman"/>
+          <w:rFonts w:ascii="EB Garamond" w:cs="EB Garamond" w:eastAsia="EB Garamond" w:hAnsi="EB Garamond"/>
           <w:b/>
           <w:bCs/>
           <w:color w:val="333333"/>
-          <w:sz w:val="17"/>
-          <w:szCs w:val="17"/>
+          <w:sz w:val="20"/>
+          <w:szCs w:val="20"/>
         </w:rPr>
         <w:t xml:space="preserve">	Oct 2015 – Apr 2017, Gurgaon</w:t>
       </w:r>
@@ -616,23 +568,26 @@
           <w:ilvl w:val="0"/>
           <w:numId w:val="1"/>
         </w:numPr>
-        <w:spacing w:after="15"/>
-      </w:pPr>
-      <w:r>
-        <w:rPr>
-          <w:rFonts w:ascii="Times New Roman" w:cs="Times New Roman" w:eastAsia="Times New Roman" w:hAnsi="Times New Roman"/>
-          <w:b/>
-          <w:bCs/>
-          <w:sz w:val="17"/>
-          <w:szCs w:val="17"/>
+        <w:spacing w:after="25" w:before="25" w:line="250"/>
+        <w:jc w:val="both"/>
+      </w:pPr>
+      <w:r>
+        <w:rPr>
+          <w:rFonts w:ascii="EB Garamond" w:cs="EB Garamond" w:eastAsia="EB Garamond" w:hAnsi="EB Garamond"/>
+          <w:b/>
+          <w:bCs/>
+          <w:color w:val="111111"/>
+          <w:sz w:val="20"/>
+          <w:szCs w:val="20"/>
         </w:rPr>
         <w:t xml:space="preserve">Analytics Pipelines: </w:t>
       </w:r>
       <w:r>
         <w:rPr>
-          <w:rFonts w:ascii="Times New Roman" w:cs="Times New Roman" w:eastAsia="Times New Roman" w:hAnsi="Times New Roman"/>
-          <w:sz w:val="17"/>
-          <w:szCs w:val="17"/>
+          <w:rFonts w:ascii="EB Garamond" w:cs="EB Garamond" w:eastAsia="EB Garamond" w:hAnsi="EB Garamond"/>
+          <w:color w:val="111111"/>
+          <w:sz w:val="20"/>
+          <w:szCs w:val="20"/>
         </w:rPr>
         <w:t xml:space="preserve">Built automated Python and SQL ETL pipelines and executive reporting dashboards.</w:t>
       </w:r>
@@ -644,23 +599,26 @@
           <w:ilvl w:val="0"/>
           <w:numId w:val="1"/>
         </w:numPr>
-        <w:spacing w:after="15"/>
-      </w:pPr>
-      <w:r>
-        <w:rPr>
-          <w:rFonts w:ascii="Times New Roman" w:cs="Times New Roman" w:eastAsia="Times New Roman" w:hAnsi="Times New Roman"/>
-          <w:b/>
-          <w:bCs/>
-          <w:sz w:val="17"/>
-          <w:szCs w:val="17"/>
+        <w:spacing w:after="25" w:before="25" w:line="250"/>
+        <w:jc w:val="both"/>
+      </w:pPr>
+      <w:r>
+        <w:rPr>
+          <w:rFonts w:ascii="EB Garamond" w:cs="EB Garamond" w:eastAsia="EB Garamond" w:hAnsi="EB Garamond"/>
+          <w:b/>
+          <w:bCs/>
+          <w:color w:val="111111"/>
+          <w:sz w:val="20"/>
+          <w:szCs w:val="20"/>
         </w:rPr>
         <w:t xml:space="preserve">Predictive Modeling: </w:t>
       </w:r>
       <w:r>
         <w:rPr>
-          <w:rFonts w:ascii="Times New Roman" w:cs="Times New Roman" w:eastAsia="Times New Roman" w:hAnsi="Times New Roman"/>
-          <w:sz w:val="17"/>
-          <w:szCs w:val="17"/>
+          <w:rFonts w:ascii="EB Garamond" w:cs="EB Garamond" w:eastAsia="EB Garamond" w:hAnsi="EB Garamond"/>
+          <w:color w:val="111111"/>
+          <w:sz w:val="20"/>
+          <w:szCs w:val="20"/>
         </w:rPr>
         <w:t xml:space="preserve">Performed regression and classification modeling for business forecasting and workforce planning.</w:t>
       </w:r>
@@ -668,17 +626,18 @@
     <w:p>
       <w:pPr>
         <w:pBdr>
-          <w:bottom w:val="single" w:color="000000" w:sz="6" w:space="1"/>
+          <w:bottom w:val="single" w:color="111111" w:sz="8" w:space="2"/>
         </w:pBdr>
-        <w:spacing w:after="25" w:before="70"/>
-      </w:pPr>
-      <w:r>
-        <w:rPr>
-          <w:rFonts w:ascii="Times New Roman" w:cs="Times New Roman" w:eastAsia="Times New Roman" w:hAnsi="Times New Roman"/>
-          <w:b/>
-          <w:bCs/>
-          <w:sz w:val="20"/>
-          <w:szCs w:val="20"/>
+        <w:spacing w:after="60" w:before="180"/>
+      </w:pPr>
+      <w:r>
+        <w:rPr>
+          <w:rFonts w:ascii="EB Garamond" w:cs="EB Garamond" w:eastAsia="EB Garamond" w:hAnsi="EB Garamond"/>
+          <w:b/>
+          <w:bCs/>
+          <w:color w:val="111111"/>
+          <w:sz w:val="28"/>
+          <w:szCs w:val="28"/>
         </w:rPr>
         <w:t xml:space="preserve">Skills</w:t>
       </w:r>
@@ -690,23 +649,26 @@
           <w:ilvl w:val="0"/>
           <w:numId w:val="1"/>
         </w:numPr>
-        <w:spacing w:after="15"/>
-      </w:pPr>
-      <w:r>
-        <w:rPr>
-          <w:rFonts w:ascii="Times New Roman" w:cs="Times New Roman" w:eastAsia="Times New Roman" w:hAnsi="Times New Roman"/>
-          <w:b/>
-          <w:bCs/>
-          <w:sz w:val="17"/>
-          <w:szCs w:val="17"/>
+        <w:spacing w:after="25" w:before="25" w:line="250"/>
+        <w:jc w:val="both"/>
+      </w:pPr>
+      <w:r>
+        <w:rPr>
+          <w:rFonts w:ascii="EB Garamond" w:cs="EB Garamond" w:eastAsia="EB Garamond" w:hAnsi="EB Garamond"/>
+          <w:b/>
+          <w:bCs/>
+          <w:color w:val="111111"/>
+          <w:sz w:val="20"/>
+          <w:szCs w:val="20"/>
         </w:rPr>
         <w:t xml:space="preserve">AI Platform &amp; Agent Systems: </w:t>
       </w:r>
       <w:r>
         <w:rPr>
-          <w:rFonts w:ascii="Times New Roman" w:cs="Times New Roman" w:eastAsia="Times New Roman" w:hAnsi="Times New Roman"/>
-          <w:sz w:val="17"/>
-          <w:szCs w:val="17"/>
+          <w:rFonts w:ascii="EB Garamond" w:cs="EB Garamond" w:eastAsia="EB Garamond" w:hAnsi="EB Garamond"/>
+          <w:color w:val="111111"/>
+          <w:sz w:val="20"/>
+          <w:szCs w:val="20"/>
         </w:rPr>
         <w:t xml:space="preserve">Event-Driven Architecture, Agent Execution Harnesses, gVisor Sandboxing, Model Context Protocol (MCP), Process Orchestration, Multi-Agent Systems, Semantic Caching, LLM Compilers.</w:t>
       </w:r>
@@ -718,23 +680,26 @@
           <w:ilvl w:val="0"/>
           <w:numId w:val="1"/>
         </w:numPr>
-        <w:spacing w:after="15"/>
-      </w:pPr>
-      <w:r>
-        <w:rPr>
-          <w:rFonts w:ascii="Times New Roman" w:cs="Times New Roman" w:eastAsia="Times New Roman" w:hAnsi="Times New Roman"/>
-          <w:b/>
-          <w:bCs/>
-          <w:sz w:val="17"/>
-          <w:szCs w:val="17"/>
+        <w:spacing w:after="25" w:before="25" w:line="250"/>
+        <w:jc w:val="both"/>
+      </w:pPr>
+      <w:r>
+        <w:rPr>
+          <w:rFonts w:ascii="EB Garamond" w:cs="EB Garamond" w:eastAsia="EB Garamond" w:hAnsi="EB Garamond"/>
+          <w:b/>
+          <w:bCs/>
+          <w:color w:val="111111"/>
+          <w:sz w:val="20"/>
+          <w:szCs w:val="20"/>
         </w:rPr>
         <w:t xml:space="preserve">GenAI &amp; LLM Engineering: </w:t>
       </w:r>
       <w:r>
         <w:rPr>
-          <w:rFonts w:ascii="Times New Roman" w:cs="Times New Roman" w:eastAsia="Times New Roman" w:hAnsi="Times New Roman"/>
-          <w:sz w:val="17"/>
-          <w:szCs w:val="17"/>
+          <w:rFonts w:ascii="EB Garamond" w:cs="EB Garamond" w:eastAsia="EB Garamond" w:hAnsi="EB Garamond"/>
+          <w:color w:val="111111"/>
+          <w:sz w:val="20"/>
+          <w:szCs w:val="20"/>
         </w:rPr>
         <w:t xml:space="preserve">LLaMA, Mistral, GPT-4/Azure OpenAI, Hugging Face Transformers, BERT, BART, RoBERTa, LangChain, RAG Architectures, Vector DBs (ChromaDB, Pinecone, FAISS).</w:t>
       </w:r>
@@ -746,23 +711,26 @@
           <w:ilvl w:val="0"/>
           <w:numId w:val="1"/>
         </w:numPr>
-        <w:spacing w:after="15"/>
-      </w:pPr>
-      <w:r>
-        <w:rPr>
-          <w:rFonts w:ascii="Times New Roman" w:cs="Times New Roman" w:eastAsia="Times New Roman" w:hAnsi="Times New Roman"/>
-          <w:b/>
-          <w:bCs/>
-          <w:sz w:val="17"/>
-          <w:szCs w:val="17"/>
+        <w:spacing w:after="25" w:before="25" w:line="250"/>
+        <w:jc w:val="both"/>
+      </w:pPr>
+      <w:r>
+        <w:rPr>
+          <w:rFonts w:ascii="EB Garamond" w:cs="EB Garamond" w:eastAsia="EB Garamond" w:hAnsi="EB Garamond"/>
+          <w:b/>
+          <w:bCs/>
+          <w:color w:val="111111"/>
+          <w:sz w:val="20"/>
+          <w:szCs w:val="20"/>
         </w:rPr>
         <w:t xml:space="preserve">Machine Learning &amp; Data Science: </w:t>
       </w:r>
       <w:r>
         <w:rPr>
-          <w:rFonts w:ascii="Times New Roman" w:cs="Times New Roman" w:eastAsia="Times New Roman" w:hAnsi="Times New Roman"/>
-          <w:sz w:val="17"/>
-          <w:szCs w:val="17"/>
+          <w:rFonts w:ascii="EB Garamond" w:cs="EB Garamond" w:eastAsia="EB Garamond" w:hAnsi="EB Garamond"/>
+          <w:color w:val="111111"/>
+          <w:sz w:val="20"/>
+          <w:szCs w:val="20"/>
         </w:rPr>
         <w:t xml:space="preserve">PyTorch, TensorFlow, Scikit-Learn, spaCy, NLTK, NER, Regression, Classification, Clustering, Time-Series, Recommendation Systems.</w:t>
       </w:r>
@@ -774,23 +742,26 @@
           <w:ilvl w:val="0"/>
           <w:numId w:val="1"/>
         </w:numPr>
-        <w:spacing w:after="15"/>
-      </w:pPr>
-      <w:r>
-        <w:rPr>
-          <w:rFonts w:ascii="Times New Roman" w:cs="Times New Roman" w:eastAsia="Times New Roman" w:hAnsi="Times New Roman"/>
-          <w:b/>
-          <w:bCs/>
-          <w:sz w:val="17"/>
-          <w:szCs w:val="17"/>
+        <w:spacing w:after="25" w:before="25" w:line="250"/>
+        <w:jc w:val="both"/>
+      </w:pPr>
+      <w:r>
+        <w:rPr>
+          <w:rFonts w:ascii="EB Garamond" w:cs="EB Garamond" w:eastAsia="EB Garamond" w:hAnsi="EB Garamond"/>
+          <w:b/>
+          <w:bCs/>
+          <w:color w:val="111111"/>
+          <w:sz w:val="20"/>
+          <w:szCs w:val="20"/>
         </w:rPr>
         <w:t xml:space="preserve">Languages &amp; Infrastructure: </w:t>
       </w:r>
       <w:r>
         <w:rPr>
-          <w:rFonts w:ascii="Times New Roman" w:cs="Times New Roman" w:eastAsia="Times New Roman" w:hAnsi="Times New Roman"/>
-          <w:sz w:val="17"/>
-          <w:szCs w:val="17"/>
+          <w:rFonts w:ascii="EB Garamond" w:cs="EB Garamond" w:eastAsia="EB Garamond" w:hAnsi="EB Garamond"/>
+          <w:color w:val="111111"/>
+          <w:sz w:val="20"/>
+          <w:szCs w:val="20"/>
         </w:rPr>
         <w:t xml:space="preserve">Python, TypeScript, SQL (PostgreSQL, MySQL), FastAPI, Flask, Docker, Kubernetes, AWS (EC2, S3, SageMaker, Lambda), Git, CI/CD, Linux.</w:t>
       </w:r>
@@ -798,70 +769,71 @@
     <w:p>
       <w:pPr>
         <w:pBdr>
-          <w:bottom w:val="single" w:color="000000" w:sz="6" w:space="1"/>
+          <w:bottom w:val="single" w:color="111111" w:sz="8" w:space="2"/>
         </w:pBdr>
-        <w:spacing w:after="25" w:before="70"/>
-      </w:pPr>
-      <w:r>
-        <w:rPr>
-          <w:rFonts w:ascii="Times New Roman" w:cs="Times New Roman" w:eastAsia="Times New Roman" w:hAnsi="Times New Roman"/>
-          <w:b/>
-          <w:bCs/>
-          <w:sz w:val="20"/>
-          <w:szCs w:val="20"/>
+        <w:spacing w:after="60" w:before="180"/>
+      </w:pPr>
+      <w:r>
+        <w:rPr>
+          <w:rFonts w:ascii="EB Garamond" w:cs="EB Garamond" w:eastAsia="EB Garamond" w:hAnsi="EB Garamond"/>
+          <w:b/>
+          <w:bCs/>
+          <w:color w:val="111111"/>
+          <w:sz w:val="28"/>
+          <w:szCs w:val="28"/>
         </w:rPr>
         <w:t xml:space="preserve">Education</w:t>
       </w:r>
     </w:p>
     <w:p>
       <w:pPr>
-        <w:spacing w:after="15" w:before="30"/>
-      </w:pPr>
-      <w:r>
-        <w:rPr>
-          <w:rFonts w:ascii="Times New Roman" w:cs="Times New Roman" w:eastAsia="Times New Roman" w:hAnsi="Times New Roman"/>
-          <w:b/>
-          <w:bCs/>
-          <w:sz w:val="18"/>
-          <w:szCs w:val="18"/>
+        <w:spacing w:after="20" w:before="30"/>
+      </w:pPr>
+      <w:r>
+        <w:rPr>
+          <w:rFonts w:ascii="EB Garamond" w:cs="EB Garamond" w:eastAsia="EB Garamond" w:hAnsi="EB Garamond"/>
+          <w:b/>
+          <w:bCs/>
+          <w:sz w:val="20"/>
+          <w:szCs w:val="20"/>
         </w:rPr>
         <w:t xml:space="preserve">PG-Diploma in Artificial Intelligence (PGDAI)</w:t>
       </w:r>
       <w:r>
         <w:rPr>
-          <w:rFonts w:ascii="Times New Roman" w:cs="Times New Roman" w:eastAsia="Times New Roman" w:hAnsi="Times New Roman"/>
-          <w:sz w:val="18"/>
-          <w:szCs w:val="18"/>
+          <w:rFonts w:ascii="EB Garamond" w:cs="EB Garamond" w:eastAsia="EB Garamond" w:hAnsi="EB Garamond"/>
+          <w:sz w:val="20"/>
+          <w:szCs w:val="20"/>
         </w:rPr>
         <w:t xml:space="preserve"> — C-DAC, Pune, 2022</w:t>
       </w:r>
     </w:p>
     <w:p>
       <w:pPr>
-        <w:spacing w:after="30"/>
-      </w:pPr>
-      <w:r>
-        <w:rPr>
-          <w:rFonts w:ascii="Times New Roman" w:cs="Times New Roman" w:eastAsia="Times New Roman" w:hAnsi="Times New Roman"/>
-          <w:b/>
-          <w:bCs/>
-          <w:sz w:val="18"/>
-          <w:szCs w:val="18"/>
+        <w:spacing w:after="20" w:before="15"/>
+      </w:pPr>
+      <w:r>
+        <w:rPr>
+          <w:rFonts w:ascii="EB Garamond" w:cs="EB Garamond" w:eastAsia="EB Garamond" w:hAnsi="EB Garamond"/>
+          <w:b/>
+          <w:bCs/>
+          <w:sz w:val="20"/>
+          <w:szCs w:val="20"/>
         </w:rPr>
         <w:t xml:space="preserve">B.Tech in Mechanical Engineering</w:t>
       </w:r>
       <w:r>
         <w:rPr>
-          <w:rFonts w:ascii="Times New Roman" w:cs="Times New Roman" w:eastAsia="Times New Roman" w:hAnsi="Times New Roman"/>
-          <w:sz w:val="18"/>
-          <w:szCs w:val="18"/>
+          <w:rFonts w:ascii="EB Garamond" w:cs="EB Garamond" w:eastAsia="EB Garamond" w:hAnsi="EB Garamond"/>
+          <w:sz w:val="20"/>
+          <w:szCs w:val="20"/>
         </w:rPr>
         <w:t xml:space="preserve"> — JIET, Jind, 2014</w:t>
       </w:r>
     </w:p>
     <w:sectPr>
       <w:pgSz w:w="11906" w:h="16838" w:orient="portrait"/>
-      <w:pgMar w:top="600" w:right="720" w:bottom="600" w:left="720" w:header="708" w:footer="708" w:gutter="0"/>
+      <w:pgMar w:top="540" w:right="720" w:bottom="540" w:left="720" w:header="708" w:footer="708" w:gutter="0"/>
       <w:pgNumType/>
       <w:docGrid w:linePitch="360"/>
     </w:sectPr>
@@ -1045,7 +1017,14 @@
 <file path=word/styles.xml><?xml version="1.0" encoding="utf-8"?>
 <w:styles xmlns:mc="http://schemas.openxmlformats.org/markup-compatibility/2006" xmlns:r="http://schemas.openxmlformats.org/officeDocument/2006/relationships" xmlns:w="http://schemas.openxmlformats.org/wordprocessingml/2006/main" xmlns:w14="http://schemas.microsoft.com/office/word/2010/wordml" xmlns:w15="http://schemas.microsoft.com/office/word/2012/wordml" mc:Ignorable="w14 w15">
   <w:docDefaults>
-    <w:rPrDefault/>
+    <w:rPrDefault>
+      <w:rPr>
+        <w:rFonts w:ascii="EB Garamond" w:cs="EB Garamond" w:eastAsia="EB Garamond" w:hAnsi="EB Garamond"/>
+        <w:color w:val="111111"/>
+        <w:sz w:val="20"/>
+        <w:szCs w:val="20"/>
+      </w:rPr>
+    </w:rPrDefault>
     <w:pPrDefault/>
   </w:docDefaults>
   <w:style w:type="paragraph" w:styleId="Title">

</xml_diff>